<commit_message>
Book 7: revise EMC consequences and renumber drafts
</commit_message>
<xml_diff>
--- a/EE - SERIES/Packaging_Layout_EMC_and_Test_Book7_REV1.docx
+++ b/EE - SERIES/Packaging_Layout_EMC_and_Test_Book7_REV1.docx
@@ -565,7 +565,7 @@
         <w:spacing w:after="160"/>
       </w:pPr>
       <w:r>
-        <w:t>In a memory-bound inference workload, a 2026 AI accelerator can spend much of each token step waiting for weights and cached context to arrive. Its arithmetic units may be rated at two quadrillion operations per second, while the memory system delivers data at a much lower rate. For these workloads, the chip behaves less like a calculator than a queue waiting for data. The queue does not become shorter because the arithmetic units are fast.</w:t>
+        <w:t xml:space="preserve">In a memory-bound inference workload, a 2026 AI accelerator can spend much of each token step waiting for weights and cached context to arrive. Its arithmetic units may be rated at two quadrillion operations per second, while the memory system delivers data at a much lower rate. For these workloads, the chip behaves less like a calculator than a queue waiting for data.</w:t>
       </w:r>
     </w:p>
     <w:p>
@@ -1821,7 +1821,7 @@
         <w:spacing w:after="160"/>
       </w:pPr>
       <w:r>
-        <w:t>Hold a processor's supply within 24 mV while its current jumps by hundreds of amperes in a microsecond. That is the job, and the arithmetic is merciless: at 875 A, a tenth of a milliohm of copper already drops 87.5 mV, more than three times the whole budget. A return-path or plane-inductance error can use that margin before the regulator has time to respond.</w:t>
+        <w:t xml:space="preserve">Hold a processor's supply within 24 mV while its current jumps by hundreds of amperes in a microsecond. That is the job, and the arithmetic is merciless: at 875 A, a tenth of a milliohm of copper already drops 87.5 mV, more than three times the whole budget.</w:t>
       </w:r>
     </w:p>
     <w:p>
@@ -1865,7 +1865,7 @@
         <w:rPr>
           <w:i w:val="0"/>
         </w:rPr>
-        <w:t>The processor tolerates a supply variation of a few percent. If the load current can change by ΔI, the power-delivery network seen from the die must have an impedance no greater than the allowed voltage change divided by ΔI, at every frequency from the regulator's control bandwidth up to the frequencies where the die's own capacitance takes over. That figure, the target impedance, is the specification for the whole network. The regulator covers low frequencies, bulk and ceramic capacitors on the board and package cover the middle, and on-package and on-die capacitance cover the highest frequencies, each handing over to the next without a resonant peak that exceeds the target. This target is a first cut, not the finished impedance mask: mounting inductance, package and via geometry, antiresonance, and capacitor DC-bias derating move the measured curve. Sections 3.2–3.5 and Chapter 11 add those effects; verify the assembled network with extracted models and load-step measurements before treating the target as met.</w:t>
+        <w:t>The processor tolerates a supply variation of a few percent. If the load current can change by ΔI, the power-delivery network seen from the die must have an impedance no greater than the allowed voltage change divided by ΔI, at every frequency from the regulator's control bandwidth up to the frequencies where the die's own capacitance takes over. That figure, the target impedance, is the specification for the whole network. The regulator covers low frequencies, bulk and ceramic capacitors on the board and package cover the middle, and on-package and on-die capacitance cover the highest frequencies, each handing over to the next without a resonant peak that exceeds the target.</w:t>
       </w:r>
     </w:p>
     <w:p>
@@ -2024,7 +2024,7 @@
         <w:rPr>
           <w:i w:val="0"/>
         </w:rPr>
-        <w:t>Resistance limits the steady drop; inductance limits the response to a step. A load that changes by 400 A in a microsecond through an effective loop inductance of 100 pH produces L di/dt = 100 × 10⁻¹² × 400/10⁻⁶ = 40 mV, again larger than the budget. The capacitors close to the die must supply the current until the slower regulator catches up, and their effectiveness is limited by the inductance of their own mounting and vias. Placing capacitors inside the package, using silicon capacitors in the interposer, and building deep-trench capacitors on the die reduce that inductance. For scale, one 1.6 mm through-via with a 0.2 mm drill is about 0.75 nH in a published board example. A broad power-ground plane pair has approximately μ₀h inductance per square: about 0.13 nH/square at 0.1 mm spacing, before current-spreading and edge effects. Package bump paths are in the tens-of-pH range in some models; one published die-side bump model uses 50 pH. That is not a universal bump value: the array loop depends on return-bump placement and mutual coupling, so use the package model rather than dividing one bump value by the bump count.</w:t>
+        <w:t>Resistance limits the steady drop; inductance limits the response to a step. A load that changes by 400 A in a microsecond through an effective loop inductance of 100 pH produces L di/dt = 100 × 10⁻¹² × 400/10⁻⁶ = 40 mV, again larger than the budget. The capacitors close to the die must supply the current until the slower regulator catches up, and their effectiveness is limited by the inductance of their own mounting and vias. Placing capacitors inside the package, using silicon capacitors in the interposer, and building deep-trench capacitors on the die reduce that inductance.</w:t>
       </w:r>
     </w:p>
     <w:p>
@@ -3930,18 +3930,13 @@
         <w:rPr>
           <w:b/>
         </w:rPr>
-        <w:t>Solution.</w:t>
-      </w:r>
-      <w:r>
-        <w:rPr>
-          <w:i w:val="0"/>
-        </w:rPr>
-      </w:r>
-      <w:r>
-        <w:rPr>
-          <w:b w:val="0"/>
-        </w:rPr>
-        <w:t xml:space="preserve"> 80% flows within ±3h, a band 0.6 mm wide centered under the trace. The 2 mm split is more than three times that width, so essentially all of the return current must detour around the end of the split, which may be centimeters away. The loop area grows by orders of magnitude; the trace's impedance changes abruptly at the split, causing reflections; and the enlarged loop radiates. The habit that follows: never route a fast signal across a split in its reference plane, and if it must change reference planes, place a stitching via or capacitor next to its signal via. The consequence is already measurable in this example: the chamber reports a 15 dB emissions failure, and the board returns for a layout change and another test cycle. If the same board carries the Book 5 radio, a clean radio schematic does not rescue a return path that has become an antenna.</w:t>
+        <w:t xml:space="preserve">Solution. </w:t>
+      </w:r>
+      <w:r>
+        <w:rPr>
+          <w:i w:val="0"/>
+        </w:rPr>
+        <w:t>80% flows within ±3h, a band 0.6 mm wide centered under the trace. The 2 mm split is more than three times that width, so essentially all of the return current must detour around the end of the split, which may be centimeters away. The loop area grows by orders of magnitude; the trace's impedance changes abruptly at the split, causing reflections; and the enlarged loop radiates. The habit that follows: never route a fast signal across a split in its reference plane, and if it must change reference planes, place a stitching via or capacitor next to its signal via.</w:t>
       </w:r>
     </w:p>
     <w:p>
@@ -8139,14 +8134,6 @@
     </w:p>
     <w:p>
       <w:pPr>
-        <w:pStyle w:val="Heading2"/>
-      </w:pPr>
-      <w:r>
-        <w:t>Part I continues. Board delivery, decoupling, and verification</w:t>
-      </w:r>
-    </w:p>
-    <w:p>
-      <w:pPr>
         <w:pStyle w:val="Heading1"/>
       </w:pPr>
       <w:bookmarkStart w:id="112" w:name="_TocAll0012"/>
@@ -8163,7 +8150,7 @@
         <w:spacing w:after="160"/>
       </w:pPr>
       <w:r>
-        <w:t>A common belief holds that adding more capacitors to a supply always helps. Add a 100 nF capacitor beside a 10 µF one on a fast rail, and the impedance at 13 MHz may rise, not fall, because the two form a parallel resonance. Decoupling is a network, and networks resonate. The extra part can improve the bill of materials while worsening the rail.</w:t>
+        <w:t xml:space="preserve">A common belief holds that adding more capacitors to a supply always helps. Add a 100 nF capacitor beside a 10 µF one on a fast rail, and the impedance at 13 MHz may rise, not fall, because the two form a parallel resonance. Decoupling is a network, and networks resonate.</w:t>
       </w:r>
     </w:p>
     <w:p>
@@ -8360,21 +8347,13 @@
         <w:rPr>
           <w:b/>
         </w:rPr>
-        <w:t>Solution.</w:t>
-      </w:r>
-      <w:r>
-        <w:rPr>
-          <w:b w:val="0"/>
-          <w:i w:val="0"/>
-        </w:rPr>
-      </w:r>
-      <w:r>
-        <w:rPr>
-          <w:b w:val="0"/>
-        </w:rPr>
-      </w:r>
-      <w:r>
-        <w:t xml:space="preserve"> 1/(2πfC) = 55 µΩ gives f = 1/(2π × 10⁻⁶ × 55 × 10⁻⁶) = 2.89 GHz, so the die capacitance alone is enough only at very high frequencies. The die capacitance and package inductance form a parallel resonance at 1/(2π√(5 × 10⁻¹² × 10⁻⁶)) = 71.2 MHz, with a characteristic impedance √(L/C) = 2.24 mΩ, forty times the target. Undamped, the network's impedance at 71 MHz could exceed 2 mΩ, and a load current pulsing at that frequency would ring the supply. The remedy is damping: enough resistance in the package capacitors, or controlled-ESR parts, to bring the peak toward the target, together with as much on-die and in-package capacitance as the area allows. If a load pattern near that resonance excites the peak, it can drive the die rail outside tolerance and cause timing faults or resets, even when the regulator itself is operating normally; this is the board-to-regulator consequence Book 6 asks the power design to survive. A load pattern near that resonance can drive the die rail outside tolerance and produce timing faults or resets, even when the regulator itself is operating normally; this is the board-to-regulator consequence Book 6 asks the power design to survive.</w:t>
+        <w:t xml:space="preserve">Solution. </w:t>
+      </w:r>
+      <w:r>
+        <w:rPr>
+          <w:i w:val="0"/>
+        </w:rPr>
+        <w:t>1/(2πfC) = 55 µΩ gives f = 1/(2π × 10⁻⁶ × 55 × 10⁻⁶) = 2.89 GHz, so the die capacitance alone is enough only at very high frequencies. The die capacitance and package inductance form a parallel resonance at 1/(2π√(5 × 10⁻¹² × 10⁻⁶)) = 71.2 MHz, with a characteristic impedance √(L/C) = 2.24 mΩ, forty times the target. Undamped, the network's impedance at 71 MHz could exceed 2 mΩ, and a load current pulsing at that frequency would ring the supply. The remedy is damping: enough resistance in the package capacitors, or controlled-ESR parts, to bring the peak toward the target, together with as much on-die and in-package capacitance as the area allows.</w:t>
       </w:r>
     </w:p>
     <w:p>
@@ -15237,7 +15216,7 @@
     <w:p>
       <w:pPr/>
       <w:r>
-        <w:t>Book 9 Chapters 25 and 26 explain VNA operation, S-parameter displays, error models, calibration standards, and de-embedding. This chapter uses those methods to validate board interconnects. Put the calibration plane at the coupon launch or use an on-board TRL standard when fixture effects dominate; make the coupon dielectric, copper, reference plane, and via geometry match the product stack-up. Select line standards for the product band; the example below sizes a two-line set for board measurements. A low-cost VNA is useful for repeatable comparisons, but its result still depends on calibration-kit quality, connector repeatability, cable movement, fixture and launch effects, noise floor, and de-embedding. There is no universal uncertainty in decibels for an inexpensive instrument; do not turn a small change into a production pass/fail decision unless the setup has an uncertainty budget that supports it.</w:t>
+        <w:t>Book 9 Chapters 25 and 26 explain VNA operation, S-parameter displays, error models, calibration standards, and de-embedding. This chapter uses those methods to validate board interconnects. Put the calibration plane at the coupon launch or use an on-board TRL standard when fixture effects dominate; make the coupon dielectric, copper, reference plane, and via geometry match the product stack-up. Select line standards for the product band; the example below sizes a two-line set for board measurements.</w:t>
       </w:r>
     </w:p>
     <w:p>
@@ -15636,7 +15615,7 @@
         <w:spacing w:after="160"/>
       </w:pPr>
       <w:r>
-        <w:t>No one designs a board to be a radio transmitter, yet every board with a 25 MHz crystal is one. Two milliamperes of a clock harmonic, flowing around a loop the size of a fingernail, produce a field at three meters that a test receiver measures within a dozen decibels of the legal limit. The receiver does not care whether the designer meant to transmit.</w:t>
+        <w:t xml:space="preserve">No one designs a board to be a radio transmitter, yet every board with a 25 MHz crystal is one. Two milliamperes of a clock harmonic, flowing around a loop the size of a fingernail, produce a field at three meters that a test receiver measures within a dozen decibels of the legal limit.</w:t>
       </w:r>
     </w:p>
     <w:p>
@@ -17668,18 +17647,13 @@
         <w:rPr>
           <w:b/>
         </w:rPr>
-        <w:t>Key idea.</w:t>
+        <w:t xml:space="preserve">Key </w:t>
       </w:r>
       <w:r>
         <w:rPr>
           <w:b w:val="0"/>
         </w:rPr>
-      </w:r>
-      <w:r>
-        <w:rPr>
-          <w:b w:val="0"/>
-        </w:rPr>
-        <w:t xml:space="preserve"> A field-strength result is incomplete without its detector, bandwidth, dwell, and governing standard. Continuous signals may read similarly on different detectors; impulsive signals can differ substantially. A peak pre-scan helps locate candidates, but the final detector is selected from the applicable standard, including any explicit alternative it permits. In the opening example, 46 dBµV quasi-peak and 52 dBµV peak are different results; against a 49 dBµV quasi-peak limit, the prescribed reading passes by 3 dB while substituting the peak value would appear to fail by 3 dB. Substituting the lower quasi-peak value for a separate peak limit can instead create a false pass.</w:t>
+        <w:t>idea. A field-strength result is incomplete without its detector, bandwidth, dwell, and governing standard. Continuous signals may read similarly on different detectors; impulsive signals can differ substantially. A peak pre-scan helps locate candidates, but the final detector is selected from the applicable standard, including any explicit alternative it permits.</w:t>
       </w:r>
     </w:p>
     <w:p>
@@ -18002,7 +17976,7 @@
         <w:spacing w:after="120"/>
       </w:pPr>
       <w:r>
-        <w:t>Scan fast with the peak detector to find the frequencies that matter, then measure only those with quasi-peak and average. Check that the step size is no larger than half the bandwidth. Turn on spread-spectrum clocking as a margin tool, not as a fix for a bad loop. The detector is part of the result, not a footnote.</w:t>
+        <w:t xml:space="preserve">Scan fast with the peak detector to find the frequencies that matter, then measure only those with quasi-peak and average. Check that the step size is no larger than half the bandwidth. Turn on spread-spectrum clocking as a margin tool, not as a fix for a bad loop.</w:t>
       </w:r>
     </w:p>
     <w:p>
@@ -20637,7 +20611,7 @@
         <w:rPr>
           <w:i w:val="0"/>
         </w:rPr>
-        <w:t>Before the accredited test, engineers measure with cheaper tools. Near-field probes, small loops and stubs connected to a spectrum analyzer, find the sources: a clock harmonic over an oscillator, a switching node, a cable connector. They do not give a field strength comparable to the limit, but they show which change helps. A GTEM cell or a bench-top setup with a calibrated antenna gives an approximate far-field reading. A near-field probe without a calibrated transfer function and controlled probe height and orientation is a source-finding tool, not an absolute field-strength measurement; its uncertainty has no universal dB value. A low-cost VNA likewise needs a calibration and repeatability budget before small S-parameter differences can be used as acceptance limits. A 6 dB pre-compliance margin is a useful engineering buffer, not an uncertainty value or a certification rule. For certification, the prescribed method, lab uncertainty, and applicable decision rule govern; ideal calculations remain design estimates.</w:t>
+        <w:t>Before the accredited test, engineers measure with cheaper tools. Near-field probes, small loops and stubs connected to a spectrum analyzer, find the sources: a clock harmonic over an oscillator, a switching node, a cable connector. They do not give a field strength comparable to the limit, but they show which change helps. A GTEM cell or a bench-top setup with a calibrated antenna gives an approximate far-field reading. Because the uncertainty of these setups, and of the final test itself, is several decibels, a common target is about 6 dB of margin below the limit in pre-compliance.</w:t>
       </w:r>
     </w:p>
     <w:p>
@@ -20707,18 +20681,13 @@
         <w:rPr>
           <w:b/>
         </w:rPr>
-        <w:t>Key idea.</w:t>
-      </w:r>
-      <w:r>
-        <w:rPr>
-          <w:i w:val="0"/>
-        </w:rPr>
-      </w:r>
-      <w:r>
-        <w:rPr>
-          <w:b w:val="0"/>
-        </w:rPr>
-        <w:t xml:space="preserve"> Pre-compliance with near-field probes and a margin of about 6 dB turns the accredited test into a confirmation. The lab measures and reports; the designer owns the margin. Example 28.3 needs an 8 dB improvement to move a board 2 dB over the limit to the 6 dB design buffer; Example 28.4 then shows that production spread alone can consume another 1.7 dB.</w:t>
+        <w:t xml:space="preserve">Key idea. </w:t>
+      </w:r>
+      <w:r>
+        <w:rPr>
+          <w:i w:val="0"/>
+        </w:rPr>
+        <w:t>Pre-compliance with near-field probes and a margin of about 6 dB turns the accredited test into a confirmation. The lab measures and reports; the designer owns the margin.</w:t>
       </w:r>
     </w:p>
     <w:p>
@@ -20738,7 +20707,7 @@
         <w:rPr>
           <w:i w:val="0"/>
         </w:rPr>
-        <w:t>A compliance test measures one unit, but the declaration covers every unit built. CISPR TR 16-4-3 describes this statistical approach for mass-produced products; apply the 80/80 rule only where the governing product standard or regulatory procedure invokes it, and use that edition’s sample plan and factors: with 80 % confidence, at least 80 % of the production must comply. When a sample of n units is measured, the rule is met at each frequency if x̄ + kS ≤ L, where x̄ is the mean of the readings in dBµV/m, S is their sample standard deviation, L is the limit, and k is a factor from the non-central t-distribution that falls as the sample grows: 2.04 for 3 units, 1.69 for 4, 1.52 for 5, 1.42 for 6, and 1.20 for 12. A product that passes on a single unit by 1 dB may fail the rule when several units are measured, because the spread of the clock oscillator, the cable dress, and the assembly adds to the mean. This is the second reason, beside measurement uncertainty, for designing to a margin of several decibels.</w:t>
+        <w:t>A compliance test measures one unit, but the declaration covers every unit built. CISPR standards address this with a statistical rule: with 80 % confidence, at least 80 % of the production must comply. When a sample of n units is measured, the rule is met at each frequency if x̄ + kS ≤ L, where x̄ is the mean of the readings in dBµV/m, S is their sample standard deviation, L is the limit, and k is a factor from the non-central t-distribution that falls as the sample grows: 2.04 for 3 units, 1.69 for 4, 1.52 for 5, 1.42 for 6, and 1.20 for 12. A product that passes on a single unit by 1 dB may fail the rule when several units are measured, because the spread of the clock oscillator, the cable dress, and the assembly adds to the mean. This is the second reason, beside measurement uncertainty, for designing to a margin of several decibels.</w:t>
       </w:r>
     </w:p>
     <w:p>
@@ -20874,7 +20843,7 @@
         <w:spacing w:after="120"/>
       </w:pPr>
       <w:r>
-        <w:t>Measure early and cheaply: a near-field probe and a spectrum analyzer on the first prototype find most sources. Keep at least 6 dB of margin at pre-compliance. When the product goes to production, test several units and apply the 80/80 rule rather than certifying the best one. One unit is a prototype; production is a distribution.</w:t>
+        <w:t xml:space="preserve">Measure early and cheaply: a near-field probe and a spectrum analyzer on the first prototype find most sources. Keep at least 6 dB of margin at pre-compliance. When the product goes to production, test several units and apply the 80/80 rule rather than certifying the best one.</w:t>
       </w:r>
     </w:p>
     <w:p>
@@ -21149,7 +21118,7 @@
         <w:spacing w:after="160"/>
       </w:pPr>
       <w:r>
-        <w:t>A humanoid robot balances on one foot while its arms reach for a cup, and its motor drives switch 48 V in nanoseconds a few centimeters from a camera and an IMU. Every book in this series is inside it at once, and the hardest problems are where those books meet. It does not care which volume supplied the fix.</w:t>
+        <w:t xml:space="preserve">A humanoid robot balances on one foot while its arms reach for a cup, and its motor drives switch 48 V in nanoseconds a few centimeters from a camera and an IMU. Every book in this series is inside it at once, and the hardest problems are where those books meet.</w:t>
       </w:r>
     </w:p>
     <w:p>
@@ -21173,7 +21142,7 @@
         <w:rPr>
           <w:b w:val="0"/>
         </w:rPr>
-        <w:t>A mobile robot, and in 2026 particularly the humanoid and the mobile manipulator, is one product that draws on all nine books. Book 1 supplies the foundations; Book 2, circuits and control; Book 3, device behavior; Book 4, RF hardware; Book 5, communications; Book 6, power and energy; this book, packaging, layout, and EMC; Book 8, firmware; and Book 9, measurement. A robot uses them together: its battery feeds motor converters, feedback loops stabilize its joints, MEMS sensors report motion, radios carry data, and the package must keep heat and switching noise from disrupting the computer. This chapter focuses on those boundaries rather than repeating each volume's full treatment. It uses a few numbers to show how the subjects meet. The robot here is a worked design thread, not a report of a tested prototype: each number is an assumption to check against a chosen motor, board, enclosure, and test plan. If the camera link drops frames only when a motor accelerates, the useful diagnosis is at the boundary: Book 6’s current transient, Book 7’s return path and package, and Book 8’s dropped-frame log have to agree on the same event.</w:t>
+        <w:t>A mobile robot, and in 2026 particularly the humanoid and the mobile manipulator, is one product that draws on all nine books. Book 1 supplies the foundations; Book 2, circuits and control; Book 3, device behavior; Book 4, RF hardware; Book 5, communications; Book 6, power and energy; this book, packaging, layout, and EMC; Book 8, firmware; and Book 9, measurement. A robot uses them together: its battery feeds motor converters, feedback loops stabilize its joints, MEMS sensors report motion, radios carry data, and the package must keep heat and switching noise from disrupting the computer. This chapter focuses on those boundaries rather than repeating each volume's full treatment. It uses a few numbers to show how the subjects meet. The robot here is a worked design thread, not a report of a tested prototype: each number is an assumption to check against a chosen motor, board, enclosure, and test plan.</w:t>
       </w:r>
     </w:p>
     <w:p>
@@ -21796,7 +21765,7 @@
         <w:rPr>
           <w:i w:val="0"/>
         </w:rPr>
-        <w:t>Target impedance Ztarget = ΔV/ΔI. Copper sheet resistance ρ/t: 0.49 mΩ/square for 1 oz (35 µm); ρCu = 1.72 × 10⁻⁸ Ω·m. First-cut inductance scales: a 1.6 mm board via is roughly 0.75 nH for one published geometry; a broad plane pair is about μ₀h per square (0.13 nH/square at 0.1 mm spacing); published die-side bump models include 50 pH, but the effective array loop is geometry- and return-dependent.</w:t>
+        <w:t>Target impedance Ztarget = ΔV/ΔI. Copper sheet resistance ρ/t: 0.49 mΩ/square for 1 oz (35 µm); ρCu = 1.72 × 10⁻⁸ Ω·m.</w:t>
       </w:r>
     </w:p>
     <w:p>

</xml_diff>